<commit_message>
fix 64 contractor with detail location
</commit_message>
<xml_diff>
--- a/frontend/src/廠商投標表單(開口)/[開口契約]投標須知-工程會114.3.28版.docx
+++ b/frontend/src/廠商投標表單(開口)/[開口契約]投標須知-工程會114.3.28版.docx
@@ -13405,8 +13405,22 @@
         <w:rPr>
           <w:szCs w:val="28"/>
         </w:rPr>
-        <w:t>毗鄰縣市之土木包工業，或丙等以上綜合營造業</w:t>
-      </w:r>
+        <w:t>毗鄰縣市</w:t>
+      </w:r>
+      <w:r>
+        <w:rPr>
+          <w:szCs w:val="28"/>
+        </w:rPr>
+        <w:t>(限登記於雲林縣、嘉義縣、南投縣及彰化縣)</w:t>
+      </w:r>
+      <w:r>
+        <w:rPr>
+          <w:szCs w:val="28"/>
+        </w:rPr>
+        <w:t>之土木包工業，或丙等以上綜合營造業</w:t>
+      </w:r>
+      <w:bookmarkStart w:id="5" w:name="_GoBack"/>
+      <w:bookmarkEnd w:id="5"/>
     </w:p>
     <w:p>
       <w:pPr>
@@ -13458,7 +13472,20 @@
           <w:rFonts w:hint="eastAsia"/>
           <w:szCs w:val="28"/>
         </w:rPr>
-        <w:t>設立於雲林縣或毗鄰縣市並依營造業法規定辦理資本額增資之土木包工業，或丙等以上綜合營造業</w:t>
+        <w:t>設立於雲林縣或毗鄰縣市</w:t>
+      </w:r>
+      <w:r>
+        <w:rPr>
+          <w:szCs w:val="28"/>
+        </w:rPr>
+        <w:t>(限登記於雲林縣、嘉義縣、南投縣及彰化縣)</w:t>
+      </w:r>
+      <w:r>
+        <w:rPr>
+          <w:rFonts w:hint="eastAsia"/>
+          <w:szCs w:val="28"/>
+        </w:rPr>
+        <w:t>並依營造業法規定辦理資本額增資之土木包工業，或丙等以上綜合營造業</w:t>
       </w:r>
     </w:p>
     <w:p>
@@ -13512,59 +13539,6 @@
           <w:szCs w:val="28"/>
         </w:rPr>
         <w:t>丙等以上綜合營造業</w:t>
-      </w:r>
-    </w:p>
-    <w:p>
-      <w:pPr>
-        <w:pStyle w:val="7"/>
-        <w:ind w:left="1134" w:firstLine="0"/>
-        <w:jc w:val="both"/>
-        <w:rPr>
-          <w:szCs w:val="28"/>
-        </w:rPr>
-      </w:pPr>
-      <w:r>
-        <w:rPr>
-          <w:rFonts w:hint="eastAsia"/>
-          <w:color w:val="FF0000"/>
-          <w:spacing w:val="0"/>
-        </w:rPr>
-        <w:t>%</w:t>
-      </w:r>
-      <w:r>
-        <w:rPr>
-          <w:color w:val="FF0000"/>
-          <w:spacing w:val="0"/>
-        </w:rPr>
-        <w:t>%廠商D</w:t>
-      </w:r>
-      <w:r>
-        <w:rPr>
-          <w:rFonts w:hint="eastAsia"/>
-          <w:color w:val="FF0000"/>
-          <w:spacing w:val="0"/>
-        </w:rPr>
-        <w:t xml:space="preserve">-BOX%% </w:t>
-      </w:r>
-      <w:r>
-        <w:rPr>
-          <w:rFonts w:hint="eastAsia"/>
-          <w:szCs w:val="28"/>
-        </w:rPr>
-        <w:t>(</w:t>
-      </w:r>
-      <w:r>
-        <w:rPr>
-          <w:szCs w:val="28"/>
-        </w:rPr>
-        <w:t>4)</w:t>
-      </w:r>
-      <w:r>
-        <w:rPr>
-          <w:rFonts w:hint="eastAsia"/>
-          <w:szCs w:val="28"/>
-        </w:rPr>
-        <w:t>依營造業法規定辦理資本額增資之丙等綜合營造業，或乙等以上綜合營造業</w:t>
       </w:r>
     </w:p>
     <w:p>
@@ -13590,6 +13564,59 @@
           <w:color w:val="FF0000"/>
           <w:spacing w:val="0"/>
         </w:rPr>
+        <w:t>%廠商D</w:t>
+      </w:r>
+      <w:r>
+        <w:rPr>
+          <w:rFonts w:hint="eastAsia"/>
+          <w:color w:val="FF0000"/>
+          <w:spacing w:val="0"/>
+        </w:rPr>
+        <w:t xml:space="preserve">-BOX%% </w:t>
+      </w:r>
+      <w:r>
+        <w:rPr>
+          <w:rFonts w:hint="eastAsia"/>
+          <w:szCs w:val="28"/>
+        </w:rPr>
+        <w:t>(</w:t>
+      </w:r>
+      <w:r>
+        <w:rPr>
+          <w:szCs w:val="28"/>
+        </w:rPr>
+        <w:t>4)</w:t>
+      </w:r>
+      <w:r>
+        <w:rPr>
+          <w:rFonts w:hint="eastAsia"/>
+          <w:szCs w:val="28"/>
+        </w:rPr>
+        <w:t>依營造業法規定辦理資本額增資之丙等綜合營造業，或乙等以上綜合營造業</w:t>
+      </w:r>
+    </w:p>
+    <w:p>
+      <w:pPr>
+        <w:pStyle w:val="7"/>
+        <w:ind w:left="1134" w:firstLine="0"/>
+        <w:jc w:val="both"/>
+        <w:rPr>
+          <w:szCs w:val="28"/>
+        </w:rPr>
+      </w:pPr>
+      <w:r>
+        <w:rPr>
+          <w:rFonts w:hint="eastAsia"/>
+          <w:color w:val="FF0000"/>
+          <w:spacing w:val="0"/>
+        </w:rPr>
+        <w:t>%</w:t>
+      </w:r>
+      <w:r>
+        <w:rPr>
+          <w:color w:val="FF0000"/>
+          <w:spacing w:val="0"/>
+        </w:rPr>
         <w:t>%廠商E</w:t>
       </w:r>
       <w:r>
@@ -13673,8 +13700,6 @@
         </w:rPr>
         <w:t>依營造業法規定辦理資本額增資之乙等綜合營造業，或甲等以上綜合營造業</w:t>
       </w:r>
-      <w:bookmarkStart w:id="5" w:name="_GoBack"/>
-      <w:bookmarkEnd w:id="5"/>
     </w:p>
     <w:p>
       <w:pPr>
@@ -14092,7 +14117,15 @@
           <w:rFonts w:hint="eastAsia"/>
           <w:spacing w:val="0"/>
         </w:rPr>
-        <w:t>公告之陸資資訊服務業者。(上開業務範疇及陸資資訊服務業清單公開於經濟部</w:t>
+        <w:t>公告之陸資資訊</w:t>
+      </w:r>
+      <w:r>
+        <w:rPr>
+          <w:rFonts w:hint="eastAsia"/>
+          <w:spacing w:val="0"/>
+        </w:rPr>
+        <w:lastRenderedPageBreak/>
+        <w:t>服務業者。(上開業務範疇及陸資資訊服務業清單公開於經濟部</w:t>
       </w:r>
       <w:r>
         <w:rPr>
@@ -14130,16 +14163,7 @@
             <w:spacing w:val="0"/>
             <w:u w:val="single"/>
           </w:rPr>
-          <w:t>）</w:t>
-        </w:r>
-        <w:r>
-          <w:rPr>
-            <w:rFonts w:hint="eastAsia"/>
-            <w:spacing w:val="0"/>
-            <w:u w:val="single"/>
-          </w:rPr>
-          <w:lastRenderedPageBreak/>
-          <w:t>/相關連結/</w:t>
+          <w:t>）/相關連結/</w:t>
         </w:r>
       </w:hyperlink>
       <w:r>
@@ -14594,7 +14618,14 @@
         <w:rPr>
           <w:spacing w:val="0"/>
         </w:rPr>
-        <w:t>採購法第48條第1項第2款「發現有足以影響採購公正之違法或不當行為者」或第50條第1項第7款「其他影響採購公正之違反法令行為」</w:t>
+        <w:t>採購法第48條第1項第2款「發現有足以影響採購公正之違法或不當</w:t>
+      </w:r>
+      <w:r>
+        <w:rPr>
+          <w:spacing w:val="0"/>
+        </w:rPr>
+        <w:lastRenderedPageBreak/>
+        <w:t>行為者」或第50條第1項第7款「其他影響採購公正之違反法令行為」</w:t>
       </w:r>
       <w:r>
         <w:rPr>
@@ -14635,7 +14666,6 @@
         <w:rPr>
           <w:spacing w:val="0"/>
         </w:rPr>
-        <w:lastRenderedPageBreak/>
         <w:t>一、押標金未附或不符合規定。</w:t>
       </w:r>
     </w:p>
@@ -15323,6 +15353,7 @@
         <w:rPr>
           <w:spacing w:val="0"/>
         </w:rPr>
+        <w:lastRenderedPageBreak/>
         <w:t xml:space="preserve">        </w:t>
       </w:r>
       <w:r>
@@ -15368,7 +15399,6 @@
         <w:rPr>
           <w:spacing w:val="0"/>
         </w:rPr>
-        <w:lastRenderedPageBreak/>
         <w:t xml:space="preserve">        </w:t>
       </w:r>
       <w:r>
@@ -16084,6 +16114,7 @@
         <w:rPr>
           <w:spacing w:val="0"/>
         </w:rPr>
+        <w:lastRenderedPageBreak/>
         <w:t xml:space="preserve">        </w:t>
       </w:r>
       <w:r>
@@ -16164,7 +16195,6 @@
         </w:rPr>
       </w:pPr>
       <w:r>
-        <w:lastRenderedPageBreak/>
         <w:sym w:font="Wingdings" w:char="F0A8"/>
       </w:r>
       <w:r>
@@ -17011,14 +17041,14 @@
         <w:rPr>
           <w:spacing w:val="0"/>
         </w:rPr>
-        <w:t>其他須知（請機關自行訂定。例如：採共同投標、統包、替代方案、國內廠商標價優惠、適用或準用最有利標評選作業或優先採購環保產品等方式辦理者，應注意依相關法規，將應於招標文件載明事項納入</w:t>
+        <w:t>其他須知（請機關自行訂定。例如：採共同投標、統包、替代方案、</w:t>
       </w:r>
       <w:r>
         <w:rPr>
           <w:spacing w:val="0"/>
         </w:rPr>
         <w:lastRenderedPageBreak/>
-        <w:t>。）：</w:t>
+        <w:t>國內廠商標價優惠、適用或準用最有利標評選作業或優先採購環保產品等方式辦理者，應注意依相關法規，將應於招標文件載明事項納入。）：</w:t>
       </w:r>
     </w:p>
     <w:p>
@@ -17834,7 +17864,7 @@
         <w:rFonts w:ascii="全真楷書"/>
         <w:noProof/>
       </w:rPr>
-      <w:t>18</w:t>
+      <w:t>24</w:t>
     </w:r>
     <w:r>
       <w:rPr>
@@ -20083,7 +20113,7 @@
 </file>
 
 <file path=customXml/itemProps1.xml><?xml version="1.0" encoding="utf-8"?>
-<ds:datastoreItem xmlns:ds="http://schemas.openxmlformats.org/officeDocument/2006/customXml" ds:itemID="{C4C69EAD-D484-49B0-B83A-C0E037854AEC}">
+<ds:datastoreItem xmlns:ds="http://schemas.openxmlformats.org/officeDocument/2006/customXml" ds:itemID="{A4922751-62F3-4832-8AA2-D1033FB9ECA5}">
   <ds:schemaRefs>
     <ds:schemaRef ds:uri="http://schemas.openxmlformats.org/officeDocument/2006/bibliography"/>
   </ds:schemaRefs>

</xml_diff>